<commit_message>
Embed reference sources in Word bibliography store and add BibTeX export
- Fill the document's existing (empty) b:Sources custom XML part with all
  64 section 2 references, so they appear in Word under References >
  Manage Sources and in the Insert Citation gallery
- Add references.bib with the same 64 entries for direct import into
  Mendeley/Zotero/EndNote
- Visible document content is byte-identical to the previous version
  (hyperlinked blue citations and APA list unchanged)

Co-Authored-By: Claude Fable 5 <noreply@anthropic.com>
Claude-Session: https://claude.ai/code/session_018LPM7UjuT86VaNxhN3T3Ra
</commit_message>
<xml_diff>
--- a/Former_Teachers_draft.docx
+++ b/Former_Teachers_draft.docx
@@ -9342,7 +9342,1510 @@
 </file>
 
 <file path=customXml/item1.xml><?xml version="1.0" encoding="utf-8"?>
-<b:Sources xmlns:b="http://schemas.openxmlformats.org/officeDocument/2006/bibliography" xmlns="http://schemas.openxmlformats.org/officeDocument/2006/bibliography" SelectedStyle="\APASixthEditionOfficeOnline.xsl" StyleName="APA" Version="6"/>
+<b:Sources xmlns:b="http://schemas.openxmlformats.org/officeDocument/2006/bibliography" xmlns="http://schemas.openxmlformats.org/officeDocument/2006/bibliography" SelectedStyle="\APASixthEditionOfficeOnline.xsl" StyleName="APA" Version="6">
+  <b:Source>
+    <b:Tag>Adermon2018</b:Tag>
+    <b:SourceType>Report</b:SourceType>
+    <b:Guid>{40A1CDA4-83D0-404C-ACE0-4073570862AD}</b:Guid>
+    <b:Author>
+      <b:Author>
+        <b:NameList>
+          <b:Person>
+            <b:Last>Adermon</b:Last>
+            <b:First>A.</b:First>
+          </b:Person>
+          <b:Person>
+            <b:Last>Laun</b:Last>
+            <b:First>L.</b:First>
+          </b:Person>
+        </b:NameList>
+      </b:Author>
+    </b:Author>
+    <b:Title>Bristyrken i offentlig verksamhet [Shortage occupations in the public sector]</b:Title>
+    <b:Year>2018</b:Year>
+    <b:Publisher>Institutet för arbetsmarknads- och utbildningspolitisk utvärdering</b:Publisher>
+    <b:URL>https://www.ifau.se/globalassets/pdf/se/2018/r-2018-19-bristyrken-i-offentlig-verksamhet.pdf</b:URL>
+    <b:Comments>IFAU Rapport 2018:19</b:Comments>
+  </b:Source>
+  <b:Source>
+    <b:Tag>AE2024</b:Tag>
+    <b:SourceType>Report</b:SourceType>
+    <b:Guid>{AE2C7E5F-5B33-4343-84A2-5345E8043566}</b:Guid>
+    <b:Author>
+      <b:Author>
+        <b:Corporate>AE</b:Corporate>
+      </b:Author>
+    </b:Author>
+    <b:Title>Mange nye folkeskolelærere forlader folkeskolen på få år</b:Title>
+    <b:Year>2024</b:Year>
+    <b:Publisher>Arbejderbevægelsens Erhvervsråd</b:Publisher>
+    <b:URL>https://www.ae.dk/analyse/2024-06-mange-nye-folkeskolelaerere-forlader-folkeskolen-paa-faa-aar</b:URL>
+  </b:Source>
+  <b:Source>
+    <b:Tag>Aldeman2025</b:Tag>
+    <b:SourceType>JournalArticle</b:SourceType>
+    <b:Guid>{4DF71E4D-6364-4B2F-AC8F-7534E4B321C5}</b:Guid>
+    <b:Author>
+      <b:Author>
+        <b:NameList>
+          <b:Person>
+            <b:Last>Aldeman</b:Last>
+            <b:First>C.</b:First>
+          </b:Person>
+          <b:Person>
+            <b:Last>Yi</b:Last>
+            <b:First>S.</b:First>
+          </b:Person>
+        </b:NameList>
+      </b:Author>
+    </b:Author>
+    <b:Title>Are teachers abandoning teaching? Data show teacher turnover remains low</b:Title>
+    <b:JournalName>Education Next</b:JournalName>
+    <b:Year>2025</b:Year>
+    <b:URL>https://www.educationnext.org/are-teachers-abandoning-teaching-data-show-teacher-turnover-remains-low/</b:URL>
+    <b:Comments>18 December 2025</b:Comments>
+  </b:Source>
+  <b:Source>
+    <b:Tag>Bjornsdottir2024</b:Tag>
+    <b:SourceType>JournalArticle</b:SourceType>
+    <b:Guid>{479CB68C-C1C2-41D4-9472-E7FF7A0C48D1}</b:Guid>
+    <b:Author>
+      <b:Author>
+        <b:NameList>
+          <b:Person>
+            <b:Last>Björnsdóttir</b:Last>
+            <b:First>A.</b:First>
+          </b:Person>
+          <b:Person>
+            <b:Last>Hansen</b:Last>
+            <b:First>B.</b:First>
+          </b:Person>
+        </b:NameList>
+      </b:Author>
+    </b:Author>
+    <b:Title>Starfsmannavelta meðal kennara í grunnskólum árin 1998 til 2020</b:Title>
+    <b:JournalName>Netla — Veftímarit um uppeldi og menntun</b:JournalName>
+    <b:Year>2024</b:Year>
+    <b:StandardNumber>doi:10.24270/serritnetla.2024.6</b:StandardNumber>
+    <b:URL>https://doi.org/10.24270/serritnetla.2024.6</b:URL>
+    <b:Comments>Sérrit 2024 — Menntakvika</b:Comments>
+  </b:Source>
+  <b:Source>
+    <b:Tag>Boyd2011</b:Tag>
+    <b:SourceType>JournalArticle</b:SourceType>
+    <b:Guid>{BB214683-D26C-446C-8FD4-1225BAE48745}</b:Guid>
+    <b:Author>
+      <b:Author>
+        <b:NameList>
+          <b:Person>
+            <b:Last>Boyd</b:Last>
+            <b:First>D.</b:First>
+          </b:Person>
+          <b:Person>
+            <b:Last>Grossman</b:Last>
+            <b:First>P.</b:First>
+          </b:Person>
+          <b:Person>
+            <b:Last>Ing</b:Last>
+            <b:First>M.</b:First>
+          </b:Person>
+          <b:Person>
+            <b:Last>Lankford</b:Last>
+            <b:First>H.</b:First>
+          </b:Person>
+          <b:Person>
+            <b:Last>Loeb</b:Last>
+            <b:First>S.</b:First>
+          </b:Person>
+          <b:Person>
+            <b:Last>Wyckoff</b:Last>
+            <b:First>J.</b:First>
+          </b:Person>
+        </b:NameList>
+      </b:Author>
+    </b:Author>
+    <b:Title>The influence of school administrators on teacher retention decisions</b:Title>
+    <b:JournalName>American Educational Research Journal</b:JournalName>
+    <b:Year>2011</b:Year>
+    <b:Pages>303–333</b:Pages>
+    <b:Volume>48</b:Volume>
+    <b:Issue>2</b:Issue>
+    <b:StandardNumber>doi:10.3102/0002831210380788</b:StandardNumber>
+    <b:URL>https://doi.org/10.3102/0002831210380788</b:URL>
+  </b:Source>
+  <b:Source>
+    <b:Tag>Brandenburg2024</b:Tag>
+    <b:SourceType>JournalArticle</b:SourceType>
+    <b:Guid>{18BFF8E7-1A4D-4FC4-83B7-7D97C2760530}</b:Guid>
+    <b:Author>
+      <b:Author>
+        <b:NameList>
+          <b:Person>
+            <b:Last>Brandenburg</b:Last>
+            <b:First>R.</b:First>
+          </b:Person>
+          <b:Person>
+            <b:Last>Larsen</b:Last>
+            <b:First>E.</b:First>
+          </b:Person>
+          <b:Person>
+            <b:Last>Simpson</b:Last>
+            <b:First>A.</b:First>
+          </b:Person>
+          <b:Person>
+            <b:Last>Sallis</b:Last>
+            <b:First>R.</b:First>
+          </b:Person>
+          <b:Person>
+            <b:Last>Tran</b:Last>
+            <b:First>D.</b:First>
+          </b:Person>
+        </b:NameList>
+      </b:Author>
+    </b:Author>
+    <b:Title>‘I left the teaching profession... and this is what I am doing now’: A national study of teacher attrition</b:Title>
+    <b:JournalName>The Australian Educational Researcher</b:JournalName>
+    <b:Year>2024</b:Year>
+    <b:Pages>2381–2400</b:Pages>
+    <b:Volume>51</b:Volume>
+    <b:Issue>5</b:Issue>
+    <b:StandardNumber>doi:10.1007/s13384-024-00697-1</b:StandardNumber>
+    <b:URL>https://doi.org/10.1007/s13384-024-00697-1</b:URL>
+  </b:Source>
+  <b:Source>
+    <b:Tag>Buckley2025</b:Tag>
+    <b:SourceType>Report</b:SourceType>
+    <b:Guid>{451F232F-4487-4536-96A6-68C04225634E}</b:Guid>
+    <b:Author>
+      <b:Author>
+        <b:NameList>
+          <b:Person>
+            <b:Last>Buckley</b:Last>
+            <b:First>J.</b:First>
+          </b:Person>
+          <b:Person>
+            <b:Last>Griselda</b:Last>
+            <b:First>S.</b:First>
+          </b:Person>
+        </b:NameList>
+      </b:Author>
+    </b:Author>
+    <b:Title>Who stays, who goes? A new look at teacher attrition using administrative data</b:Title>
+    <b:Year>2025</b:Year>
+    <b:Publisher>e61 Institute</b:Publisher>
+    <b:URL>https://e61.in/who-stays-who-goes-a-new-look-at-teacher-attrition-using-administrative-data/</b:URL>
+    <b:Comments>e61 Institute Research Note</b:Comments>
+  </b:Source>
+  <b:Source>
+    <b:Tag>CarverThomas2019</b:Tag>
+    <b:SourceType>JournalArticle</b:SourceType>
+    <b:Guid>{372C9A51-60F7-41EB-8035-A52EE53D498D}</b:Guid>
+    <b:Author>
+      <b:Author>
+        <b:NameList>
+          <b:Person>
+            <b:Last>Carver-Thomas</b:Last>
+            <b:First>D.</b:First>
+          </b:Person>
+          <b:Person>
+            <b:Last>Darling-Hammond</b:Last>
+            <b:First>L.</b:First>
+          </b:Person>
+        </b:NameList>
+      </b:Author>
+    </b:Author>
+    <b:Title>The trouble with teacher turnover: How teacher attrition affects students and schools</b:Title>
+    <b:JournalName>Education Policy Analysis Archives</b:JournalName>
+    <b:Year>2019</b:Year>
+    <b:Volume>27</b:Volume>
+    <b:Issue>36</b:Issue>
+    <b:StandardNumber>doi:10.14507/epaa.27.3699</b:StandardNumber>
+    <b:URL>https://doi.org/10.14507/epaa.27.3699</b:URL>
+  </b:Source>
+  <b:Source>
+    <b:Tag>CBSIsrael2023</b:Tag>
+    <b:SourceType>Report</b:SourceType>
+    <b:Guid>{F456EE2D-C9D2-495A-B7C8-1C4F3B1D00DC}</b:Guid>
+    <b:Author>
+      <b:Author>
+        <b:Corporate>CBS Israel</b:Corporate>
+      </b:Author>
+    </b:Author>
+    <b:Title>Teaching staff leaving the education system</b:Title>
+    <b:Year>2023</b:Year>
+    <b:Publisher>Central Bureau of Statistics</b:Publisher>
+    <b:URL>https://www.cbs.gov.il/</b:URL>
+    <b:Comments>Full bibliographic details to be completed before publication</b:Comments>
+  </b:Source>
+  <b:Source>
+    <b:Tag>CIAE2025</b:Tag>
+    <b:SourceType>Report</b:SourceType>
+    <b:Guid>{A1316ECB-04F0-4FFA-A6AD-C74C965BEC3B}</b:Guid>
+    <b:Author>
+      <b:Author>
+        <b:Corporate>CIAE</b:Corporate>
+      </b:Author>
+    </b:Author>
+    <b:Title>Abandono docente en el sistema educativo chileno 2015–2024</b:Title>
+    <b:Year>2025</b:Year>
+    <b:Publisher>Observatorio de Formación Docente, Universidad de Chile</b:Publisher>
+    <b:URL>https://ciae.uchile.cl/noticia/abandono-docente-en-la-educacion-publica-llega-solo-a-4-anual-y-profesores-se-mantendrian-25-anos-en-ejercicio</b:URL>
+    <b:Comments>Informe OFD No. 12, by J. P. Valenzuela and F. Meneses</b:Comments>
+  </b:Source>
+  <b:Source>
+    <b:Tag>Clotfelter2008</b:Tag>
+    <b:SourceType>JournalArticle</b:SourceType>
+    <b:Guid>{4354DDD7-6128-40C3-B6A1-191237C5B02E}</b:Guid>
+    <b:Author>
+      <b:Author>
+        <b:NameList>
+          <b:Person>
+            <b:Last>Clotfelter</b:Last>
+            <b:First>C.</b:First>
+          </b:Person>
+          <b:Person>
+            <b:Last>Glennie</b:Last>
+            <b:First>E.</b:First>
+          </b:Person>
+          <b:Person>
+            <b:Last>Ladd</b:Last>
+            <b:First>H.</b:First>
+          </b:Person>
+          <b:Person>
+            <b:Last>Vigdor</b:Last>
+            <b:First>J.</b:First>
+          </b:Person>
+        </b:NameList>
+      </b:Author>
+    </b:Author>
+    <b:Title>Would higher salaries keep teachers in high-poverty schools? Evidence from a policy intervention in North Carolina</b:Title>
+    <b:JournalName>Journal of Public Economics</b:JournalName>
+    <b:Year>2008</b:Year>
+    <b:Pages>1352–1370</b:Pages>
+    <b:Volume>92</b:Volume>
+    <b:Issue>5–6</b:Issue>
+    <b:StandardNumber>doi:10.1016/j.jpubeco.2007.07.003</b:StandardNumber>
+    <b:URL>https://doi.org/10.1016/j.jpubeco.2007.07.003</b:URL>
+  </b:Source>
+  <b:Source>
+    <b:Tag>Costrell2009</b:Tag>
+    <b:SourceType>JournalArticle</b:SourceType>
+    <b:Guid>{D27792FF-7BCB-4631-8ACC-EE8361B2DB7A}</b:Guid>
+    <b:Author>
+      <b:Author>
+        <b:NameList>
+          <b:Person>
+            <b:Last>Costrell</b:Last>
+            <b:First>R. M.</b:First>
+          </b:Person>
+          <b:Person>
+            <b:Last>Podgursky</b:Last>
+            <b:First>M.</b:First>
+          </b:Person>
+        </b:NameList>
+      </b:Author>
+    </b:Author>
+    <b:Title>Peaks, cliffs, and valleys: The peculiar incentives in teacher retirement systems and their consequences for school staffing</b:Title>
+    <b:JournalName>Education Finance and Policy</b:JournalName>
+    <b:Year>2009</b:Year>
+    <b:Pages>175–211</b:Pages>
+    <b:Volume>4</b:Volume>
+    <b:Issue>2</b:Issue>
+    <b:StandardNumber>doi:10.1162/edfp.2009.4.2.175</b:StandardNumber>
+    <b:URL>https://doi.org/10.1162/edfp.2009.4.2.175</b:URL>
+  </b:Source>
+  <b:Source>
+    <b:Tag>DeCesare2017</b:Tag>
+    <b:SourceType>Report</b:SourceType>
+    <b:Guid>{F454EDED-9B3D-407B-97BF-509A28B9DD48}</b:Guid>
+    <b:Author>
+      <b:Author>
+        <b:NameList>
+          <b:Person>
+            <b:Last>DeCesare</b:Last>
+            <b:First>D.</b:First>
+          </b:Person>
+          <b:Person>
+            <b:Last>McClelland</b:Last>
+            <b:First>A.</b:First>
+          </b:Person>
+          <b:Person>
+            <b:Last>Randel</b:Last>
+            <b:First>B.</b:First>
+          </b:Person>
+        </b:NameList>
+      </b:Author>
+    </b:Author>
+    <b:Title>Impacts of the Retired Mentors for New Teachers program</b:Title>
+    <b:Year>2017</b:Year>
+    <b:Publisher>Regional Educational Laboratory Central, Institute of Education Sciences, U.S. Department of Education</b:Publisher>
+    <b:URL>https://ies.ed.gov/ncee/edlabs</b:URL>
+    <b:Comments>REL 2017-225</b:Comments>
+  </b:Source>
+  <b:Source>
+    <b:Tag>DfE2023</b:Tag>
+    <b:SourceType>Report</b:SourceType>
+    <b:Guid>{629E8BC9-B69B-4278-A0DE-6CC4396EC5A8}</b:Guid>
+    <b:Author>
+      <b:Author>
+        <b:Corporate>Department for Education</b:Corporate>
+      </b:Author>
+    </b:Author>
+    <b:Title>School workforce in England: Ad hoc statistics on maternity leave and returns</b:Title>
+    <b:Year>2023</b:Year>
+    <b:Publisher>Department for Education</b:Publisher>
+    <b:Comments>Release to be verified before publication</b:Comments>
+  </b:Source>
+  <b:Source>
+    <b:Tag>DfE2024a</b:Tag>
+    <b:SourceType>Report</b:SourceType>
+    <b:Guid>{053C5A22-4184-4B2B-B260-D1A05EE5A5CC}</b:Guid>
+    <b:Author>
+      <b:Author>
+        <b:Corporate>Department for Education</b:Corporate>
+      </b:Author>
+    </b:Author>
+    <b:Title>School workforce in England: Reporting year 2023</b:Title>
+    <b:Year>2024a</b:Year>
+    <b:Publisher>Department for Education</b:Publisher>
+    <b:URL>https://explore-education-statistics.service.gov.uk/find-statistics/school-workforce-in-england</b:URL>
+  </b:Source>
+  <b:Source>
+    <b:Tag>DfE2024b</b:Tag>
+    <b:SourceType>Report</b:SourceType>
+    <b:Guid>{541C6AE3-4B7C-4C59-8783-BF35D638EA18}</b:Guid>
+    <b:Author>
+      <b:Author>
+        <b:Corporate>Department for Education</b:Corporate>
+      </b:Author>
+    </b:Author>
+    <b:Title>Working lives of teachers and leaders: Wave 3 and wave 4 reports</b:Title>
+    <b:Year>2024b</b:Year>
+    <b:Publisher>Department for Education</b:Publisher>
+    <b:URL>https://www.gov.uk/government/publications/working-lives-of-teachers-and-leaders</b:URL>
+  </b:Source>
+  <b:Source>
+    <b:Tag>EducationCounts2025</b:Tag>
+    <b:SourceType>InternetSite</b:SourceType>
+    <b:Guid>{7E2D17B5-8A16-429D-992F-F4AA716067A0}</b:Guid>
+    <b:Author>
+      <b:Author>
+        <b:Corporate>Education Counts</b:Corporate>
+      </b:Author>
+    </b:Author>
+    <b:Title>Teacher turnover</b:Title>
+    <b:Year>2025</b:Year>
+    <b:Publisher>New Zealand Ministry of Education</b:Publisher>
+    <b:URL>https://www.educationcounts.govt.nz/statistics/teacher-turnover</b:URL>
+  </b:Source>
+  <b:Source>
+    <b:Tag>Eurydice2021</b:Tag>
+    <b:SourceType>Report</b:SourceType>
+    <b:Guid>{A744F6BE-E933-41A7-800E-D1A2A2D576DE}</b:Guid>
+    <b:Author>
+      <b:Author>
+        <b:Corporate>European Commission/EACEA/Eurydice</b:Corporate>
+      </b:Author>
+    </b:Author>
+    <b:Title>Teachers in Europe: Careers, development and well-being</b:Title>
+    <b:Year>2021</b:Year>
+    <b:Publisher>Publications Office of the European Union</b:Publisher>
+    <b:Comments>Eurydice report</b:Comments>
+  </b:Source>
+  <b:Source>
+    <b:Tag>Falch2011</b:Tag>
+    <b:SourceType>JournalArticle</b:SourceType>
+    <b:Guid>{3BBE102F-DB05-4DDA-BCA3-DE39C2E2A5EC}</b:Guid>
+    <b:Author>
+      <b:Author>
+        <b:NameList>
+          <b:Person>
+            <b:Last>Falch</b:Last>
+            <b:First>T.</b:First>
+          </b:Person>
+        </b:NameList>
+      </b:Author>
+    </b:Author>
+    <b:Title>Teacher mobility responses to wage changes: Evidence from a quasi-natural experiment</b:Title>
+    <b:JournalName>American Economic Review</b:JournalName>
+    <b:Year>2011</b:Year>
+    <b:Pages>460–465</b:Pages>
+    <b:Volume>101</b:Volume>
+    <b:Issue>3</b:Issue>
+    <b:StandardNumber>doi:10.1257/aer.101.3.460</b:StandardNumber>
+    <b:URL>https://doi.org/10.1257/aer.101.3.460</b:URL>
+  </b:Source>
+  <b:Source>
+    <b:Tag>Feng2018</b:Tag>
+    <b:SourceType>JournalArticle</b:SourceType>
+    <b:Guid>{57643129-2318-41F6-83E7-E618DEA8B3F2}</b:Guid>
+    <b:Author>
+      <b:Author>
+        <b:NameList>
+          <b:Person>
+            <b:Last>Feng</b:Last>
+            <b:First>L.</b:First>
+          </b:Person>
+          <b:Person>
+            <b:Last>Sass</b:Last>
+            <b:First>T. R.</b:First>
+          </b:Person>
+        </b:NameList>
+      </b:Author>
+    </b:Author>
+    <b:Title>The impact of incentives to recruit and retain teachers in “hard-to-staff” subjects</b:Title>
+    <b:JournalName>Journal of Policy Analysis and Management</b:JournalName>
+    <b:Year>2018</b:Year>
+    <b:Pages>112–135</b:Pages>
+    <b:Volume>37</b:Volume>
+    <b:Issue>1</b:Issue>
+    <b:StandardNumber>doi:10.1002/pam.22037</b:StandardNumber>
+    <b:URL>https://doi.org/10.1002/pam.22037</b:URL>
+  </b:Source>
+  <b:Source>
+    <b:Tag>Fitzpatrick2015</b:Tag>
+    <b:SourceType>JournalArticle</b:SourceType>
+    <b:Guid>{AFE0F89B-26F3-450E-9C55-A178B475652D}</b:Guid>
+    <b:Author>
+      <b:Author>
+        <b:NameList>
+          <b:Person>
+            <b:Last>Fitzpatrick</b:Last>
+            <b:First>M. D.</b:First>
+          </b:Person>
+        </b:NameList>
+      </b:Author>
+    </b:Author>
+    <b:Title>How much are public school teachers willing to pay for their retirement benefits?</b:Title>
+    <b:JournalName>American Economic Journal: Economic Policy</b:JournalName>
+    <b:Year>2015</b:Year>
+    <b:Pages>165–188</b:Pages>
+    <b:Volume>7</b:Volume>
+    <b:Issue>4</b:Issue>
+    <b:StandardNumber>doi:10.1257/pol.20140087</b:StandardNumber>
+    <b:URL>https://doi.org/10.1257/pol.20140087</b:URL>
+  </b:Source>
+  <b:Source>
+    <b:Tag>GovSpain2015</b:Tag>
+    <b:SourceType>Report</b:SourceType>
+    <b:Guid>{6EADFAA2-10C3-4414-9C7E-294A8198B9D2}</b:Guid>
+    <b:Author>
+      <b:Author>
+        <b:Corporate>Government of Spain</b:Corporate>
+      </b:Author>
+    </b:Author>
+    <b:Title>Real Decreto Legislativo 5/2015, de 30 de octubre, por el que se aprueba el texto refundido de la Ley del Estatuto Básico del Empleado Público</b:Title>
+    <b:Year>2015</b:Year>
+    <b:Publisher>Boletín Oficial del Estado</b:Publisher>
+    <b:URL>https://www.boe.es/eli/es/rdlg/2015/10/30/5/con</b:URL>
+    <b:Comments>Articles 49 and 89</b:Comments>
+  </b:Source>
+  <b:Source>
+    <b:Tag>Grissom2012</b:Tag>
+    <b:SourceType>JournalArticle</b:SourceType>
+    <b:Guid>{57B3A721-241D-4CAE-92FE-637F44FB46BF}</b:Guid>
+    <b:Author>
+      <b:Author>
+        <b:NameList>
+          <b:Person>
+            <b:Last>Grissom</b:Last>
+            <b:First>J. A.</b:First>
+          </b:Person>
+          <b:Person>
+            <b:Last>Reininger</b:Last>
+            <b:First>M.</b:First>
+          </b:Person>
+        </b:NameList>
+      </b:Author>
+    </b:Author>
+    <b:Title>Who comes back? A longitudinal analysis of the reentry behavior of exiting teachers</b:Title>
+    <b:JournalName>Education Finance and Policy</b:JournalName>
+    <b:Year>2012</b:Year>
+    <b:Pages>425–454</b:Pages>
+    <b:Volume>7</b:Volume>
+    <b:Issue>4</b:Issue>
+    <b:StandardNumber>doi:10.1162/EDFP_a_00075</b:StandardNumber>
+    <b:URL>https://doi.org/10.1162/EDFP_a_00075</b:URL>
+  </b:Source>
+  <b:Source>
+    <b:Tag>Guarino2006</b:Tag>
+    <b:SourceType>JournalArticle</b:SourceType>
+    <b:Guid>{4345BFD7-2098-435C-A583-E054831C4B53}</b:Guid>
+    <b:Author>
+      <b:Author>
+        <b:NameList>
+          <b:Person>
+            <b:Last>Guarino</b:Last>
+            <b:First>C. M.</b:First>
+          </b:Person>
+          <b:Person>
+            <b:Last>Santibañez</b:Last>
+            <b:First>L.</b:First>
+          </b:Person>
+          <b:Person>
+            <b:Last>Daley</b:Last>
+            <b:First>G. A.</b:First>
+          </b:Person>
+        </b:NameList>
+      </b:Author>
+    </b:Author>
+    <b:Title>Teacher recruitment and retention: A review of the recent empirical literature</b:Title>
+    <b:JournalName>Review of Educational Research</b:JournalName>
+    <b:Year>2006</b:Year>
+    <b:Pages>173–208</b:Pages>
+    <b:Volume>76</b:Volume>
+    <b:Issue>2</b:Issue>
+    <b:StandardNumber>doi:10.3102/00346543076002173</b:StandardNumber>
+    <b:URL>https://doi.org/10.3102/00346543076002173</b:URL>
+  </b:Source>
+  <b:Source>
+    <b:Tag>Gundlach2024</b:Tag>
+    <b:SourceType>JournalArticle</b:SourceType>
+    <b:Guid>{31A41259-D301-421D-8EEB-9F02586EA86C}</b:Guid>
+    <b:Author>
+      <b:Author>
+        <b:NameList>
+          <b:Person>
+            <b:Last>Gundlach</b:Last>
+            <b:First>H. A. D.</b:First>
+          </b:Person>
+          <b:Person>
+            <b:Last>Slemp</b:Last>
+            <b:First>G. R.</b:First>
+          </b:Person>
+          <b:Person>
+            <b:Last>Hattie</b:Last>
+            <b:First>J.</b:First>
+          </b:Person>
+        </b:NameList>
+      </b:Author>
+    </b:Author>
+    <b:Title>A meta-analysis of the antecedents of teacher turnover and retention</b:Title>
+    <b:JournalName>Educational Research Review</b:JournalName>
+    <b:Year>2024</b:Year>
+    <b:Pages>100606</b:Pages>
+    <b:Volume>44</b:Volume>
+    <b:StandardNumber>doi:10.1016/j.edurev.2024.100606</b:StandardNumber>
+    <b:URL>https://doi.org/10.1016/j.edurev.2024.100606</b:URL>
+    <b:Comments>Article 100606</b:Comments>
+  </b:Source>
+  <b:Source>
+    <b:Tag>Harris2007</b:Tag>
+    <b:SourceType>JournalArticle</b:SourceType>
+    <b:Guid>{353AE73F-9F45-445E-9F3E-888798472490}</b:Guid>
+    <b:Author>
+      <b:Author>
+        <b:NameList>
+          <b:Person>
+            <b:Last>Harris</b:Last>
+            <b:First>D. N.</b:First>
+          </b:Person>
+          <b:Person>
+            <b:Last>Adams</b:Last>
+            <b:First>S. J.</b:First>
+          </b:Person>
+        </b:NameList>
+      </b:Author>
+    </b:Author>
+    <b:Title>Understanding the level and causes of teacher turnover: A comparison with other professions</b:Title>
+    <b:JournalName>Economics of Education Review</b:JournalName>
+    <b:Year>2007</b:Year>
+    <b:Pages>325–337</b:Pages>
+    <b:Volume>26</b:Volume>
+    <b:Issue>3</b:Issue>
+    <b:StandardNumber>doi:10.1016/j.econedurev.2005.09.007</b:StandardNumber>
+    <b:URL>https://doi.org/10.1016/j.econedurev.2005.09.007</b:URL>
+  </b:Source>
+  <b:Source>
+    <b:Tag>Johnson2012</b:Tag>
+    <b:SourceType>JournalArticle</b:SourceType>
+    <b:Guid>{BF0857A6-3CD5-4002-8159-C370EA67FC97}</b:Guid>
+    <b:Author>
+      <b:Author>
+        <b:NameList>
+          <b:Person>
+            <b:Last>Johnson</b:Last>
+            <b:First>S. M.</b:First>
+          </b:Person>
+          <b:Person>
+            <b:Last>Kraft</b:Last>
+            <b:First>M. A.</b:First>
+          </b:Person>
+          <b:Person>
+            <b:Last>Papay</b:Last>
+            <b:First>J. P.</b:First>
+          </b:Person>
+        </b:NameList>
+      </b:Author>
+    </b:Author>
+    <b:Title>How context matters in high-need schools: The effects of teachers’ working conditions on their professional satisfaction and their students’ achievement</b:Title>
+    <b:JournalName>Teachers College Record</b:JournalName>
+    <b:Year>2012</b:Year>
+    <b:Pages>1–39</b:Pages>
+    <b:Volume>114</b:Volume>
+    <b:Issue>10</b:Issue>
+    <b:StandardNumber>doi:10.1177/016146811211401004</b:StandardNumber>
+    <b:URL>https://doi.org/10.1177/016146811211401004</b:URL>
+  </b:Source>
+  <b:Source>
+    <b:Tag>Kindsiko2023</b:Tag>
+    <b:SourceType>Report</b:SourceType>
+    <b:Guid>{85DA2D55-B38E-4EDE-9103-E97B38EE13CF}</b:Guid>
+    <b:Author>
+      <b:Author>
+        <b:NameList>
+          <b:Person>
+            <b:Last>Kindsiko</b:Last>
+            <b:First>E.</b:First>
+          </b:Person>
+        </b:NameList>
+      </b:Author>
+    </b:Author>
+    <b:Title>Analysis of teacher attrition in Estonia using EHIS register data 2005/06–2021/22</b:Title>
+    <b:Year>2023</b:Year>
+    <b:Publisher>Arenguseire Keskus</b:Publisher>
+    <b:Comments>Full bibliographic details to be completed before publication</b:Comments>
+  </b:Source>
+  <b:Source>
+    <b:Tag>Kraft2016</b:Tag>
+    <b:SourceType>JournalArticle</b:SourceType>
+    <b:Guid>{E0233D4E-4554-4B39-8271-5D92BA5C3B5A}</b:Guid>
+    <b:Author>
+      <b:Author>
+        <b:NameList>
+          <b:Person>
+            <b:Last>Kraft</b:Last>
+            <b:First>M. A.</b:First>
+          </b:Person>
+          <b:Person>
+            <b:Last>Marinell</b:Last>
+            <b:First>W. H.</b:First>
+          </b:Person>
+          <b:Person>
+            <b:Last>Shen-Wei Yee</b:Last>
+            <b:First>D.</b:First>
+          </b:Person>
+        </b:NameList>
+      </b:Author>
+    </b:Author>
+    <b:Title>School organizational contexts, teacher turnover, and student achievement: Evidence from panel data</b:Title>
+    <b:JournalName>American Educational Research Journal</b:JournalName>
+    <b:Year>2016</b:Year>
+    <b:Pages>1411–1449</b:Pages>
+    <b:Volume>53</b:Volume>
+    <b:Issue>5</b:Issue>
+    <b:StandardNumber>doi:10.3102/0002831216667478</b:StandardNumber>
+    <b:URL>https://doi.org/10.3102/0002831216667478</b:URL>
+  </b:Source>
+  <b:Source>
+    <b:Tag>Ladd2011</b:Tag>
+    <b:SourceType>JournalArticle</b:SourceType>
+    <b:Guid>{A5CFAD1A-C32B-4650-9303-6F90EE8EED2F}</b:Guid>
+    <b:Author>
+      <b:Author>
+        <b:NameList>
+          <b:Person>
+            <b:Last>Ladd</b:Last>
+            <b:First>H. F.</b:First>
+          </b:Person>
+        </b:NameList>
+      </b:Author>
+    </b:Author>
+    <b:Title>Teachers’ perceptions of their working conditions: How predictive of planned and actual teacher movement?</b:Title>
+    <b:JournalName>Educational Evaluation and Policy Analysis</b:JournalName>
+    <b:Year>2011</b:Year>
+    <b:Pages>235–261</b:Pages>
+    <b:Volume>33</b:Volume>
+    <b:Issue>2</b:Issue>
+    <b:StandardNumber>doi:10.3102/0162373711398128</b:StandardNumber>
+    <b:URL>https://doi.org/10.3102/0162373711398128</b:URL>
+  </b:Source>
+  <b:Source>
+    <b:Tag>Madigan2021</b:Tag>
+    <b:SourceType>JournalArticle</b:SourceType>
+    <b:Guid>{BFE30961-B4D3-4A99-AB00-FE6BA73A8DDF}</b:Guid>
+    <b:Author>
+      <b:Author>
+        <b:NameList>
+          <b:Person>
+            <b:Last>Madigan</b:Last>
+            <b:First>D. J.</b:First>
+          </b:Person>
+          <b:Person>
+            <b:Last>Kim</b:Last>
+            <b:First>L. E.</b:First>
+          </b:Person>
+        </b:NameList>
+      </b:Author>
+    </b:Author>
+    <b:Title>Towards an understanding of teacher attrition: A meta-analysis of burnout, job satisfaction, and teachers’ intentions to quit</b:Title>
+    <b:JournalName>Teaching and Teacher Education</b:JournalName>
+    <b:Year>2021</b:Year>
+    <b:Pages>103425</b:Pages>
+    <b:Volume>105</b:Volume>
+    <b:StandardNumber>doi:10.1016/j.tate.2021.103425</b:StandardNumber>
+    <b:URL>https://doi.org/10.1016/j.tate.2021.103425</b:URL>
+    <b:Comments>Article 103425</b:Comments>
+  </b:Source>
+  <b:Source>
+    <b:Tag>Ministere2023</b:Tag>
+    <b:SourceType>InternetSite</b:SourceType>
+    <b:Guid>{700ADBD4-9178-44D2-97FA-B553641D44D4}</b:Guid>
+    <b:Author>
+      <b:Author>
+        <b:Corporate>Ministère de l’Éducation nationale</b:Corporate>
+      </b:Author>
+    </b:Author>
+    <b:Title>La retraite des personnels de l’Éducation nationale</b:Title>
+    <b:Year>2023</b:Year>
+    <b:URL>https://www.education.gouv.fr/la-retraite-des-personnels-de-l-education-nationale-41489</b:URL>
+  </b:Source>
+  <b:Source>
+    <b:Tag>MoEKorea2023</b:Tag>
+    <b:SourceType>Report</b:SourceType>
+    <b:Guid>{43C2FEC8-621E-48A9-8380-B5F0B8171202}</b:Guid>
+    <b:Author>
+      <b:Author>
+        <b:Corporate>Ministry of Education Korea</b:Corporate>
+      </b:Author>
+    </b:Author>
+    <b:Title>Statistics on mid-career teacher separations 2019–2023</b:Title>
+    <b:Year>2023</b:Year>
+    <b:Publisher>Ministry of Education, Sejong</b:Publisher>
+    <b:Comments>Full bibliographic details to be completed before publication</b:Comments>
+  </b:Source>
+  <b:Source>
+    <b:Tag>Moyer2022</b:Tag>
+    <b:SourceType>JournalArticle</b:SourceType>
+    <b:Guid>{51C9B607-F5C3-41DF-B21F-B251F3CA2AEF}</b:Guid>
+    <b:Author>
+      <b:Author>
+        <b:NameList>
+          <b:Person>
+            <b:Last>Moyer</b:Last>
+            <b:First>A.</b:First>
+          </b:Person>
+        </b:NameList>
+      </b:Author>
+    </b:Author>
+    <b:Title>Has “who comes back” changed? Teacher reentry 2000–2019</b:Title>
+    <b:JournalName>Educational Researcher</b:JournalName>
+    <b:Year>2022</b:Year>
+    <b:Pages>544–546</b:Pages>
+    <b:Volume>51</b:Volume>
+    <b:Issue>8</b:Issue>
+    <b:StandardNumber>doi:10.3102/0013189X221122746</b:StandardNumber>
+    <b:URL>https://doi.org/10.3102/0013189X221122746</b:URL>
+  </b:Source>
+  <b:Source>
+    <b:Tag>NCES2014</b:Tag>
+    <b:SourceType>Report</b:SourceType>
+    <b:Guid>{B4DFD54B-EDC7-4346-9AA1-54C6F8B53FC2}</b:Guid>
+    <b:Author>
+      <b:Author>
+        <b:Corporate>NCES</b:Corporate>
+      </b:Author>
+    </b:Author>
+    <b:Title>Teacher attrition and mobility: Results from the 2012–13 Teacher Follow-up Survey</b:Title>
+    <b:Year>2014</b:Year>
+    <b:Publisher>National Center for Education Statistics, U.S. Department of Education</b:Publisher>
+    <b:URL>https://nces.ed.gov/pubs2014/2014077.pdf</b:URL>
+    <b:Comments>NCES 2014-077</b:Comments>
+  </b:Source>
+  <b:Source>
+    <b:Tag>NCES2024</b:Tag>
+    <b:SourceType>Report</b:SourceType>
+    <b:Guid>{532B07FA-BEB8-4648-A9B4-50A9447B3C17}</b:Guid>
+    <b:Author>
+      <b:Author>
+        <b:Corporate>NCES</b:Corporate>
+      </b:Author>
+    </b:Author>
+    <b:Title>Teacher attrition and mobility: Results from the 2021–22 Teacher Follow-up Survey</b:Title>
+    <b:Year>2024</b:Year>
+    <b:Publisher>National Center for Education Statistics, U.S. Department of Education</b:Publisher>
+    <b:URL>https://nces.ed.gov/pubsearch/pubsinfo.asp?pubid=2024039</b:URL>
+  </b:Source>
+  <b:Source>
+    <b:Tag>Nguyen2024</b:Tag>
+    <b:SourceType>JournalArticle</b:SourceType>
+    <b:Guid>{B14F00C9-F4A8-4F0C-8DC8-49150BD033CF}</b:Guid>
+    <b:Author>
+      <b:Author>
+        <b:NameList>
+          <b:Person>
+            <b:Last>Nguyen</b:Last>
+            <b:First>T. D.</b:First>
+          </b:Person>
+          <b:Person>
+            <b:Last>Lam</b:Last>
+            <b:First>C. D.</b:First>
+          </b:Person>
+          <b:Person>
+            <b:Last>Bruno</b:Last>
+            <b:First>P.</b:First>
+          </b:Person>
+        </b:NameList>
+      </b:Author>
+    </b:Author>
+    <b:Title>What do we know about the extent of teacher shortages nationwide? A systematic examination of reports of U.S. teacher shortages</b:Title>
+    <b:JournalName>AERA Open</b:JournalName>
+    <b:Year>2024</b:Year>
+    <b:Volume>10</b:Volume>
+    <b:StandardNumber>doi:10.1177/23328584241276512</b:StandardNumber>
+    <b:URL>https://doi.org/10.1177/23328584241276512</b:URL>
+  </b:Source>
+  <b:Source>
+    <b:Tag>Nguyen2020</b:Tag>
+    <b:SourceType>JournalArticle</b:SourceType>
+    <b:Guid>{E5CFBC7E-BE4A-4A2F-B1CF-2980BCA58258}</b:Guid>
+    <b:Author>
+      <b:Author>
+        <b:NameList>
+          <b:Person>
+            <b:Last>Nguyen</b:Last>
+            <b:First>T. D.</b:First>
+          </b:Person>
+          <b:Person>
+            <b:Last>Pham</b:Last>
+            <b:First>L. D.</b:First>
+          </b:Person>
+          <b:Person>
+            <b:Last>Crouch</b:Last>
+            <b:First>M.</b:First>
+          </b:Person>
+          <b:Person>
+            <b:Last>Springer</b:Last>
+            <b:First>M. G.</b:First>
+          </b:Person>
+        </b:NameList>
+      </b:Author>
+    </b:Author>
+    <b:Title>The correlates of teacher turnover: An updated and expanded meta-analysis of the literature</b:Title>
+    <b:JournalName>Educational Research Review</b:JournalName>
+    <b:Year>2020</b:Year>
+    <b:Pages>100355</b:Pages>
+    <b:Volume>31</b:Volume>
+    <b:StandardNumber>doi:10.1016/j.edurev.2020.100355</b:StandardNumber>
+    <b:URL>https://doi.org/10.1016/j.edurev.2020.100355</b:URL>
+    <b:Comments>Article 100355</b:Comments>
+  </b:Source>
+  <b:Source>
+    <b:Tag>Ni2022</b:Tag>
+    <b:SourceType>JournalArticle</b:SourceType>
+    <b:Guid>{1692B1AF-1254-451D-A85E-7350C8DFE6C3}</b:Guid>
+    <b:Author>
+      <b:Author>
+        <b:NameList>
+          <b:Person>
+            <b:Last>Ni</b:Last>
+            <b:First>S.</b:First>
+          </b:Person>
+          <b:Person>
+            <b:Last>Podgursky</b:Last>
+            <b:First>M.</b:First>
+          </b:Person>
+          <b:Person>
+            <b:Last>Wang</b:Last>
+            <b:First>F.</b:First>
+          </b:Person>
+        </b:NameList>
+      </b:Author>
+    </b:Author>
+    <b:Title>How much are public school teachers willing to pay for their retirement benefits? Comment</b:Title>
+    <b:JournalName>American Economic Journal: Economic Policy</b:JournalName>
+    <b:Year>2022</b:Year>
+    <b:Pages>478–493</b:Pages>
+    <b:Volume>14</b:Volume>
+    <b:Issue>3</b:Issue>
+    <b:StandardNumber>doi:10.1257/pol.20200763</b:StandardNumber>
+    <b:URL>https://doi.org/10.1257/pol.20200763</b:URL>
+  </b:Source>
+  <b:Source>
+    <b:Tag>Nickow2024</b:Tag>
+    <b:SourceType>JournalArticle</b:SourceType>
+    <b:Guid>{B0BFC219-42B4-4CA4-B937-35125B12544C}</b:Guid>
+    <b:Author>
+      <b:Author>
+        <b:NameList>
+          <b:Person>
+            <b:Last>Nickow</b:Last>
+            <b:First>A.</b:First>
+          </b:Person>
+          <b:Person>
+            <b:Last>Oreopoulos</b:Last>
+            <b:First>P.</b:First>
+          </b:Person>
+          <b:Person>
+            <b:Last>Quan</b:Last>
+            <b:First>V.</b:First>
+          </b:Person>
+        </b:NameList>
+      </b:Author>
+    </b:Author>
+    <b:Title>The promise of tutoring for PreK-12 learning: A systematic review and meta-analysis of the experimental evidence</b:Title>
+    <b:JournalName>American Educational Research Journal</b:JournalName>
+    <b:Year>2024</b:Year>
+    <b:Pages>74–107</b:Pages>
+    <b:Volume>61</b:Volume>
+    <b:Issue>1</b:Issue>
+    <b:StandardNumber>doi:10.3102/00028312231208687</b:StandardNumber>
+    <b:URL>https://doi.org/10.3102/00028312231208687</b:URL>
+  </b:Source>
+  <b:Source>
+    <b:Tag>NSA2025</b:Tag>
+    <b:SourceType>Report</b:SourceType>
+    <b:Guid>{9BA8C2C7-38DA-4EDC-A769-08CFA366C7A4}</b:Guid>
+    <b:Author>
+      <b:Author>
+        <b:Corporate>NŠA</b:Corporate>
+      </b:Author>
+    </b:Author>
+    <b:Title>Teacher demand and supply forecast</b:Title>
+    <b:Year>2025</b:Year>
+    <b:Publisher>Nacionalinė švietimo agentūra</b:Publisher>
+    <b:Comments>Full bibliographic details to be completed before publication</b:Comments>
+  </b:Source>
+  <b:Source>
+    <b:Tag>OECD2020</b:Tag>
+    <b:SourceType>Book</b:SourceType>
+    <b:Guid>{AE45B050-7154-49F4-A8EE-D116862FE62B}</b:Guid>
+    <b:Author>
+      <b:Author>
+        <b:Corporate>OECD</b:Corporate>
+      </b:Author>
+    </b:Author>
+    <b:Title>TALIS 2018 results (Volume II): Teachers and school leaders as valued professionals</b:Title>
+    <b:Year>2020</b:Year>
+    <b:Publisher>OECD Publishing</b:Publisher>
+    <b:StandardNumber>doi:10.1787/19cf08df-en</b:StandardNumber>
+    <b:URL>https://doi.org/10.1787/19cf08df-en</b:URL>
+  </b:Source>
+  <b:Source>
+    <b:Tag>OECD2025a</b:Tag>
+    <b:SourceType>Report</b:SourceType>
+    <b:Guid>{3043CEF3-87C5-40D1-B137-BDD32657EC84}</b:Guid>
+    <b:Author>
+      <b:Author>
+        <b:Corporate>OECD</b:Corporate>
+      </b:Author>
+    </b:Author>
+    <b:Title>What is the profile of the teaching workforce and how has it evolved?</b:Title>
+    <b:Year>2025a</b:Year>
+    <b:Publisher>OECD Publishing</b:Publisher>
+    <b:StandardNumber>doi:10.1787/f7b0b326-en</b:StandardNumber>
+    <b:URL>https://doi.org/10.1787/f7b0b326-en</b:URL>
+    <b:Comments>In Education at a glance 2025: OECD indicators, Indicator D8, Table D8.4</b:Comments>
+  </b:Source>
+  <b:Source>
+    <b:Tag>OECD2025b</b:Tag>
+    <b:SourceType>Book</b:SourceType>
+    <b:Guid>{3B897953-981A-4BEA-8028-AD531B713D27}</b:Guid>
+    <b:Author>
+      <b:Author>
+        <b:Corporate>OECD</b:Corporate>
+      </b:Author>
+    </b:Author>
+    <b:Title>Results from TALIS 2024</b:Title>
+    <b:Year>2025b</b:Year>
+    <b:Publisher>OECD Publishing</b:Publisher>
+    <b:StandardNumber>doi:10.1787/90df6235-en</b:StandardNumber>
+    <b:URL>https://doi.org/10.1787/90df6235-en</b:URL>
+  </b:Source>
+  <b:Source>
+    <b:Tag>OECD2025c</b:Tag>
+    <b:SourceType>Book</b:SourceType>
+    <b:Guid>{E81203F7-F030-44C3-A6D0-194992F57FCC}</b:Guid>
+    <b:Author>
+      <b:Author>
+        <b:Corporate>OECD</b:Corporate>
+      </b:Author>
+    </b:Author>
+    <b:Title>Results from TALIS 2024, country notes: Japan, France and the Netherlands</b:Title>
+    <b:Year>2025c</b:Year>
+    <b:Publisher>OECD Publishing</b:Publisher>
+    <b:StandardNumber>doi:10.1787/e127f9e2-en</b:StandardNumber>
+    <b:URL>https://doi.org/10.1787/e127f9e2-en</b:URL>
+  </b:Source>
+  <b:Source>
+    <b:Tag>OECD2025d</b:Tag>
+    <b:SourceType>Report</b:SourceType>
+    <b:Guid>{2B2F6520-E8C8-414A-8D47-018B3917CFF0}</b:Guid>
+    <b:Author>
+      <b:Author>
+        <b:Corporate>OECD</b:Corporate>
+      </b:Author>
+    </b:Author>
+    <b:Title>How much are teachers and school heads paid?</b:Title>
+    <b:Year>2025d</b:Year>
+    <b:Publisher>OECD Publishing</b:Publisher>
+    <b:StandardNumber>doi:10.1787/1c0d9c79-en</b:StandardNumber>
+    <b:URL>https://doi.org/10.1787/1c0d9c79-en</b:URL>
+    <b:Comments>In Education at a glance 2025: OECD indicators, Indicator D3, Table D3.2</b:Comments>
+  </b:Source>
+  <b:Source>
+    <b:Tag>OECD2025e</b:Tag>
+    <b:SourceType>Book</b:SourceType>
+    <b:Guid>{F8847669-298C-4524-9DE4-A50D97F3A46B}</b:Guid>
+    <b:Author>
+      <b:Author>
+        <b:Corporate>OECD</b:Corporate>
+      </b:Author>
+    </b:Author>
+    <b:Title>Pensions at a glance 2025: OECD and G20 indicators</b:Title>
+    <b:Year>2025e</b:Year>
+    <b:Publisher>OECD Publishing</b:Publisher>
+  </b:Source>
+  <b:Source>
+    <b:Tag>Papay2020</b:Tag>
+    <b:SourceType>JournalArticle</b:SourceType>
+    <b:Guid>{51642867-4353-49E5-A53A-8FC9AE375FBF}</b:Guid>
+    <b:Author>
+      <b:Author>
+        <b:NameList>
+          <b:Person>
+            <b:Last>Papay</b:Last>
+            <b:First>J. P.</b:First>
+          </b:Person>
+          <b:Person>
+            <b:Last>Taylor</b:Last>
+            <b:First>E. S.</b:First>
+          </b:Person>
+          <b:Person>
+            <b:Last>Tyler</b:Last>
+            <b:First>J. H.</b:First>
+          </b:Person>
+          <b:Person>
+            <b:Last>Laski</b:Last>
+            <b:First>M. E.</b:First>
+          </b:Person>
+        </b:NameList>
+      </b:Author>
+    </b:Author>
+    <b:Title>Learning job skills from colleagues at work: Evidence from a field experiment using teacher performance data</b:Title>
+    <b:JournalName>American Economic Journal: Economic Policy</b:JournalName>
+    <b:Year>2020</b:Year>
+    <b:Pages>359–388</b:Pages>
+    <b:Volume>12</b:Volume>
+    <b:Issue>1</b:Issue>
+    <b:StandardNumber>doi:10.1257/pol.20170709</b:StandardNumber>
+    <b:URL>https://doi.org/10.1257/pol.20170709</b:URL>
+  </b:Source>
+  <b:Source>
+    <b:Tag>Rasanen2020</b:Tag>
+    <b:SourceType>JournalArticle</b:SourceType>
+    <b:Guid>{6AA26B49-979A-4E7C-8CA2-18C32E3E4661}</b:Guid>
+    <b:Author>
+      <b:Author>
+        <b:NameList>
+          <b:Person>
+            <b:Last>Räsänen</b:Last>
+            <b:First>K.</b:First>
+          </b:Person>
+          <b:Person>
+            <b:Last>Pietarinen</b:Last>
+            <b:First>J.</b:First>
+          </b:Person>
+          <b:Person>
+            <b:Last>Pyhältö</b:Last>
+            <b:First>K.</b:First>
+          </b:Person>
+          <b:Person>
+            <b:Last>Soini</b:Last>
+            <b:First>T.</b:First>
+          </b:Person>
+          <b:Person>
+            <b:Last>Väisänen</b:Last>
+            <b:First>P.</b:First>
+          </b:Person>
+        </b:NameList>
+      </b:Author>
+    </b:Author>
+    <b:Title>Why leave the teaching profession? A longitudinal approach to the prevalence and persistence of teacher turnover intentions</b:Title>
+    <b:JournalName>Social Psychology of Education</b:JournalName>
+    <b:Year>2020</b:Year>
+    <b:Pages>837–859</b:Pages>
+    <b:Volume>23</b:Volume>
+    <b:Issue>4</b:Issue>
+    <b:StandardNumber>doi:10.1007/s11218-020-09567-x</b:StandardNumber>
+    <b:URL>https://doi.org/10.1007/s11218-020-09567-x</b:URL>
+  </b:Source>
+  <b:Source>
+    <b:Tag>Ryan2017</b:Tag>
+    <b:SourceType>JournalArticle</b:SourceType>
+    <b:Guid>{0A86251D-3C8A-48CD-8592-915F1CF80A87}</b:Guid>
+    <b:Author>
+      <b:Author>
+        <b:NameList>
+          <b:Person>
+            <b:Last>Ryan</b:Last>
+            <b:First>S. V.</b:First>
+          </b:Person>
+          <b:Person>
+            <b:Last>von der Embse</b:Last>
+            <b:First>N. P.</b:First>
+          </b:Person>
+          <b:Person>
+            <b:Last>Pendergast</b:Last>
+            <b:First>L. L.</b:First>
+          </b:Person>
+          <b:Person>
+            <b:Last>Saeki</b:Last>
+            <b:First>E.</b:First>
+          </b:Person>
+          <b:Person>
+            <b:Last>Segool</b:Last>
+            <b:First>N.</b:First>
+          </b:Person>
+          <b:Person>
+            <b:Last>Schwing</b:Last>
+            <b:First>S.</b:First>
+          </b:Person>
+        </b:NameList>
+      </b:Author>
+    </b:Author>
+    <b:Title>Leaving the teaching profession: The role of teacher stress and educational accountability policies on turnover intent</b:Title>
+    <b:JournalName>Teaching and Teacher Education</b:JournalName>
+    <b:Year>2017</b:Year>
+    <b:Pages>1–11</b:Pages>
+    <b:Volume>66</b:Volume>
+    <b:StandardNumber>doi:10.1016/j.tate.2017.03.016</b:StandardNumber>
+    <b:URL>https://doi.org/10.1016/j.tate.2017.03.016</b:URL>
+  </b:Source>
+  <b:Source>
+    <b:Tag>See2020</b:Tag>
+    <b:SourceType>JournalArticle</b:SourceType>
+    <b:Guid>{3FE4E9E9-06F1-414A-8FA5-0A602F1C075D}</b:Guid>
+    <b:Author>
+      <b:Author>
+        <b:NameList>
+          <b:Person>
+            <b:Last>See</b:Last>
+            <b:First>B. H.</b:First>
+          </b:Person>
+          <b:Person>
+            <b:Last>Morris</b:Last>
+            <b:First>R.</b:First>
+          </b:Person>
+          <b:Person>
+            <b:Last>Gorard</b:Last>
+            <b:First>S.</b:First>
+          </b:Person>
+          <b:Person>
+            <b:Last>El Soufi</b:Last>
+            <b:First>N.</b:First>
+          </b:Person>
+        </b:NameList>
+      </b:Author>
+    </b:Author>
+    <b:Title>Teacher recruitment and retention: A critical review of international evidence of most promising interventions</b:Title>
+    <b:JournalName>Education Sciences</b:JournalName>
+    <b:Year>2020</b:Year>
+    <b:Pages>262</b:Pages>
+    <b:Volume>10</b:Volume>
+    <b:Issue>10</b:Issue>
+    <b:StandardNumber>doi:10.3390/educsci10100262</b:StandardNumber>
+    <b:URL>https://doi.org/10.3390/educsci10100262</b:URL>
+    <b:Comments>Article 262</b:Comments>
+  </b:Source>
+  <b:Source>
+    <b:Tag>Simon2015</b:Tag>
+    <b:SourceType>JournalArticle</b:SourceType>
+    <b:Guid>{39F0A02C-E660-4C60-B3B6-82197B849A6D}</b:Guid>
+    <b:Author>
+      <b:Author>
+        <b:NameList>
+          <b:Person>
+            <b:Last>Simon</b:Last>
+            <b:First>N. S.</b:First>
+          </b:Person>
+          <b:Person>
+            <b:Last>Johnson</b:Last>
+            <b:First>S. M.</b:First>
+          </b:Person>
+        </b:NameList>
+      </b:Author>
+    </b:Author>
+    <b:Title>Teacher turnover in high-poverty schools: What we know and can do</b:Title>
+    <b:JournalName>Teachers College Record</b:JournalName>
+    <b:Year>2015</b:Year>
+    <b:Pages>1–36</b:Pages>
+    <b:Volume>117</b:Volume>
+    <b:Issue>3</b:Issue>
+    <b:StandardNumber>doi:10.1177/016146811511700305</b:StandardNumber>
+    <b:URL>https://doi.org/10.1177/016146811511700305</b:URL>
+  </b:Source>
+  <b:Source>
+    <b:Tag>SimsBenhenda2022</b:Tag>
+    <b:SourceType>Report</b:SourceType>
+    <b:Guid>{EA4D2ADA-C6A5-4F81-8340-06353A46A8B3}</b:Guid>
+    <b:Author>
+      <b:Author>
+        <b:NameList>
+          <b:Person>
+            <b:Last>Sims</b:Last>
+            <b:First>S.</b:First>
+          </b:Person>
+          <b:Person>
+            <b:Last>Benhenda</b:Last>
+            <b:First>A.</b:First>
+          </b:Person>
+        </b:NameList>
+      </b:Author>
+    </b:Author>
+    <b:Title>The effect of financial incentives on the retention of shortage-subject teachers: Evidence from England</b:Title>
+    <b:Year>2022</b:Year>
+    <b:Publisher>UCL Centre for Education Policy and Equalising Opportunities</b:Publisher>
+    <b:URL>https://repec-cepeo.ucl.ac.uk/cepeow/cepeowp22-04.pdf</b:URL>
+    <b:Comments>CEPEO Working Paper No. 22-04</b:Comments>
+  </b:Source>
+  <b:Source>
+    <b:Tag>SimsJerrim2020</b:Tag>
+    <b:SourceType>Report</b:SourceType>
+    <b:Guid>{1FCC34B5-D875-4538-B44B-5000B3D79DFB}</b:Guid>
+    <b:Author>
+      <b:Author>
+        <b:NameList>
+          <b:Person>
+            <b:Last>Sims</b:Last>
+            <b:First>S.</b:First>
+          </b:Person>
+          <b:Person>
+            <b:Last>Jerrim</b:Last>
+            <b:First>J.</b:First>
+          </b:Person>
+        </b:NameList>
+      </b:Author>
+    </b:Author>
+    <b:Title>TALIS 2018: Teacher working conditions, turnover and attrition</b:Title>
+    <b:Year>2020</b:Year>
+    <b:Publisher>Department for Education</b:Publisher>
+    <b:URL>https://www.gov.uk/government/publications/talis-2018-teacher-working-conditions-turnover-and-attrition</b:URL>
+    <b:Comments>Statistical working paper</b:Comments>
+  </b:Source>
+  <b:Source>
+    <b:Tag>Springer2016</b:Tag>
+    <b:SourceType>JournalArticle</b:SourceType>
+    <b:Guid>{940033A6-354D-41B9-AC54-9F8D29C0FC0D}</b:Guid>
+    <b:Author>
+      <b:Author>
+        <b:NameList>
+          <b:Person>
+            <b:Last>Springer</b:Last>
+            <b:First>M. G.</b:First>
+          </b:Person>
+          <b:Person>
+            <b:Last>Swain</b:Last>
+            <b:First>W. A.</b:First>
+          </b:Person>
+          <b:Person>
+            <b:Last>Rodriguez</b:Last>
+            <b:First>L. A.</b:First>
+          </b:Person>
+        </b:NameList>
+      </b:Author>
+    </b:Author>
+    <b:Title>Effective teacher retention bonuses: Evidence from Tennessee</b:Title>
+    <b:JournalName>Educational Evaluation and Policy Analysis</b:JournalName>
+    <b:Year>2016</b:Year>
+    <b:Pages>199–221</b:Pages>
+    <b:Volume>38</b:Volume>
+    <b:Issue>2</b:Issue>
+    <b:StandardNumber>doi:10.3102/0162373715609687</b:StandardNumber>
+    <b:URL>https://doi.org/10.3102/0162373715609687</b:URL>
+  </b:Source>
+  <b:Source>
+    <b:Tag>StatNorway2025</b:Tag>
+    <b:SourceType>InternetSite</b:SourceType>
+    <b:Guid>{067B11AB-B4FB-480A-A8BF-3F7AFA2F07DE}</b:Guid>
+    <b:Author>
+      <b:Author>
+        <b:Corporate>Statistics Norway</b:Corporate>
+      </b:Author>
+    </b:Author>
+    <b:Title>Articles on the labour-market attachment of trained teachers</b:Title>
+    <b:Year>2025</b:Year>
+    <b:Publisher>Statistisk sentralbyrå</b:Publisher>
+    <b:URL>https://www.ssb.no/</b:URL>
+    <b:Comments>Full bibliographic details to be completed before publication</b:Comments>
+  </b:Source>
+  <b:Source>
+    <b:Tag>StatSweden2023</b:Tag>
+    <b:SourceType>Report</b:SourceType>
+    <b:Guid>{3ED2F56D-09D2-449E-8F90-0079A0A68C65}</b:Guid>
+    <b:Author>
+      <b:Author>
+        <b:Corporate>Statistics Sweden</b:Corporate>
+      </b:Author>
+    </b:Author>
+    <b:Title>Lärare utanför yrket 2022/2023 [Teachers outside the profession 2022/2023]</b:Title>
+    <b:Year>2023</b:Year>
+    <b:Publisher>Statistiska centralbyrån</b:Publisher>
+    <b:URL>https://www.scb.se/</b:URL>
+  </b:Source>
+  <b:Source>
+    <b:Tag>Stinebrickner2002</b:Tag>
+    <b:SourceType>JournalArticle</b:SourceType>
+    <b:Guid>{67B383D6-C24B-4A18-BB22-7EDFE4D564B3}</b:Guid>
+    <b:Author>
+      <b:Author>
+        <b:NameList>
+          <b:Person>
+            <b:Last>Stinebrickner</b:Last>
+            <b:First>T. R.</b:First>
+          </b:Person>
+        </b:NameList>
+      </b:Author>
+    </b:Author>
+    <b:Title>An analysis of occupational change and departure from the labor force: Evidence of the reasons that teachers leave</b:Title>
+    <b:JournalName>Journal of Human Resources</b:JournalName>
+    <b:Year>2002</b:Year>
+    <b:Pages>192–216</b:Pages>
+    <b:Volume>37</b:Volume>
+    <b:Issue>1</b:Issue>
+    <b:StandardNumber>doi:10.2307/3069608</b:StandardNumber>
+    <b:URL>https://doi.org/10.2307/3069608</b:URL>
+  </b:Source>
+  <b:Source>
+    <b:Tag>TCANZ2016</b:Tag>
+    <b:SourceType>Report</b:SourceType>
+    <b:Guid>{8FF1BAEB-8130-458F-ADEA-62218D7A888C}</b:Guid>
+    <b:Author>
+      <b:Author>
+        <b:Corporate>Teaching Council of Aotearoa New Zealand</b:Corporate>
+      </b:Author>
+    </b:Author>
+    <b:Title>Teaching Council Rules 2016</b:Title>
+    <b:Year>2016</b:Year>
+    <b:Publisher>New Zealand Legislation</b:Publisher>
+    <b:URL>https://www.legislation.govt.nz/regulation/public/2016/0122/latest/whole.html</b:URL>
+    <b:Comments>LI 2016/122</b:Comments>
+  </b:Source>
+  <b:Source>
+    <b:Tag>UNESCO2024</b:Tag>
+    <b:SourceType>Book</b:SourceType>
+    <b:Guid>{ED6171A1-135E-4272-A6F8-D41B6CAAB538}</b:Guid>
+    <b:Author>
+      <b:Author>
+        <b:Corporate>UNESCO</b:Corporate>
+      </b:Author>
+    </b:Author>
+    <b:Title>Global report on teachers: Addressing teacher shortages and transforming the profession</b:Title>
+    <b:Year>2024</b:Year>
+    <b:Publisher>UNESCO and the International Task Force on Teachers for Education 2030</b:Publisher>
+    <b:StandardNumber>doi:10.54675/FIGU8035</b:StandardNumber>
+    <b:URL>https://doi.org/10.54675/FIGU8035</b:URL>
+  </b:Source>
+  <b:Source>
+    <b:Tag>VanCasteren2023</b:Tag>
+    <b:SourceType>Report</b:SourceType>
+    <b:Guid>{B4F1501A-E2B9-4B39-A95A-C51977BAE3FB}</b:Guid>
+    <b:Author>
+      <b:Author>
+        <b:NameList>
+          <b:Person>
+            <b:Last>Van Casteren</b:Last>
+            <b:First>W.</b:First>
+          </b:Person>
+          <b:Person>
+            <b:Last>Lodewick</b:Last>
+            <b:First>J.</b:First>
+          </b:Person>
+          <b:Person>
+            <b:Last>Lommertzen</b:Last>
+            <b:First>J.</b:First>
+          </b:Person>
+          <b:Person>
+            <b:Last>Luyten</b:Last>
+            <b:First>E.</b:First>
+          </b:Person>
+          <b:Person>
+            <b:Last>van Mensvoort</b:Last>
+            <b:First>C.</b:First>
+          </b:Person>
+        </b:NameList>
+      </b:Author>
+    </b:Author>
+    <b:Title>Vertrekredenen leraren en docenten in het po, vo en mbo</b:Title>
+    <b:Year>2023</b:Year>
+    <b:Publisher>ResearchNed</b:Publisher>
+    <b:URL>https://www.voion.nl/publicaties/vertrekredenen-leraren-en-docenten-in-het-po-vo-en-mbo/</b:URL>
+  </b:Source>
+  <b:Source>
+    <b:Tag>Vansteenkiste2025</b:Tag>
+    <b:SourceType>Report</b:SourceType>
+    <b:Guid>{C1E780F4-1722-4DCA-AB72-C021213F1449}</b:Guid>
+    <b:Author>
+      <b:Author>
+        <b:NameList>
+          <b:Person>
+            <b:Last>Vansteenkiste</b:Last>
+            <b:First>S.</b:First>
+          </b:Person>
+        </b:NameList>
+      </b:Author>
+    </b:Author>
+    <b:Title>De in- en uitstroom in het lerarenberoep vanuit vergelijkend perspectief</b:Title>
+    <b:Year>2025</b:Year>
+    <b:Publisher>Steunpunt Onderwijsonderzoek</b:Publisher>
+  </b:Source>
+  <b:Source>
+    <b:Tag>VIT2025</b:Tag>
+    <b:SourceType>InternetSite</b:SourceType>
+    <b:Guid>{3EE953B7-A213-48C2-8778-16620C749137}</b:Guid>
+    <b:Author>
+      <b:Author>
+        <b:Corporate>Victorian Institute of Teaching</b:Corporate>
+      </b:Author>
+    </b:Author>
+    <b:Title>Professional practice and learning requirements</b:Title>
+    <b:Year>2025</b:Year>
+    <b:URL>https://www.vit.vic.edu.au/maintain/requirements</b:URL>
+  </b:Source>
+  <b:Source>
+    <b:Tag>Walker2024</b:Tag>
+    <b:SourceType>Report</b:SourceType>
+    <b:Guid>{3EC1DBFE-73E4-4416-9D71-8B5BAC8EB84C}</b:Guid>
+    <b:Author>
+      <b:Author>
+        <b:NameList>
+          <b:Person>
+            <b:Last>Walker</b:Last>
+            <b:First>M.</b:First>
+          </b:Person>
+          <b:Person>
+            <b:Last>Worth</b:Last>
+            <b:First>J.</b:First>
+          </b:Person>
+          <b:Person>
+            <b:Last>Liht</b:Last>
+            <b:First>J.</b:First>
+          </b:Person>
+          <b:Person>
+            <b:Last>Classick</b:Last>
+            <b:First>R.</b:First>
+          </b:Person>
+          <b:Person>
+            <b:Last>Tang</b:Last>
+            <b:First>S.</b:First>
+          </b:Person>
+          <b:Person>
+            <b:Last>Rutt</b:Last>
+            <b:First>S.</b:First>
+          </b:Person>
+          <b:Person>
+            <b:Last>Straw</b:Last>
+            <b:First>S.</b:First>
+          </b:Person>
+        </b:NameList>
+      </b:Author>
+    </b:Author>
+    <b:Title>Evaluation of the early roll-out of the Early Career Framework: Evaluation report</b:Title>
+    <b:Year>2024</b:Year>
+    <b:Publisher>National Foundation for Educational Research for the Education Endowment Foundation</b:Publisher>
+    <b:URL>https://d2tic4wvo1iusb.cloudfront.net/production/documents/projects/ECF_early_year_rollout_evaluation_report.pdf</b:URL>
+  </b:Source>
+</b:Sources>
 </file>
 
 <file path=customXml/itemProps1.xml><?xml version="1.0" encoding="utf-8"?>

</xml_diff>